<commit_message>
memo 1 page : APC alignee (deux voies, transposition monegasque a confirmer)
</commit_message>
<xml_diff>
--- a/docs/module-liberal/memo_cotation_CCAM_NGAP.docx
+++ b/docs/module-liberal/memo_cotation_CCAM_NGAP.docx
@@ -979,7 +979,7 @@
                 <w:sz w:val="15"/>
                 <w:szCs w:val="15"/>
               </w:rPr>
-              <w:t xml:space="preserve">APC 1 → 60,00 € (avis ponctuel, coeff. 1)</w:t>
+              <w:t xml:space="preserve">APC 1 → 60,00 € · avis étages ou CPA ASA ≥ 3 (art. 18B)</w:t>
             </w:r>
           </w:p>
         </w:tc>
@@ -1438,7 +1438,7 @@
           <w:sz w:val="14"/>
           <w:szCs w:val="14"/>
         </w:rPr>
-        <w:t xml:space="preserve">À coter à juste titre l'exhaustivité de ce qui est fait — jamais surcoter. Mod. 4/5 (analgésie postop) : valeur à confirmer côté CSM. APC : coeff. 1 supposé, à confirmer.</w:t>
+        <w:t xml:space="preserve">À coter à juste titre l'exhaustivité de ce qui est fait — jamais surcoter. Mod. 4/5 (analgésie postop) : valeur à confirmer côté CSM. APC : deux voies — avis étages (hors chirurgie programmée) · CPA si ASA ≥ 3 (ASA au dossier, CR ×3) ; transposition monégasque à confirmer.</w:t>
       </w:r>
     </w:p>
     <w:sectPr>

</xml_diff>